<commit_message>
docs: capture and embed Appendix D screenshots into project reports
</commit_message>
<xml_diff>
--- a/ConfMan/docs/reports/confman_report.docx
+++ b/ConfMan/docs/reports/confman_report.docx
@@ -30271,47 +30271,122 @@
       <w:pPr>
         <w:spacing w:after="60" w:before="120"/>
       </w:pPr>
-      <w:r>
-        <w:rPr>
-          <w:rFonts w:ascii="Times New Roman" w:cs="Times New Roman" w:eastAsia="Times New Roman" w:hAnsi="Times New Roman"/>
-          <w:b/>
-          <w:bCs/>
-          <w:color w:val="B22222"/>
-          <w:sz w:val="22"/>
-          <w:szCs w:val="22"/>
-        </w:rPr>
-        <w:t xml:space="preserve">[PLACEHOLDER – Figure D.1]</w:t>
+      <w:r/>
+      <w:r>
+        <w:drawing>
+          <wp:inline xmlns:a="http://schemas.openxmlformats.org/drawingml/2006/main" xmlns:pic="http://schemas.openxmlformats.org/drawingml/2006/picture">
+            <wp:extent cx="5486400" cy="6236970"/>
+            <wp:docPr id="2" name="Picture 2"/>
+            <wp:cNvGraphicFramePr>
+              <a:graphicFrameLocks noChangeAspect="1"/>
+            </wp:cNvGraphicFramePr>
+            <a:graphic>
+              <a:graphicData uri="http://schemas.openxmlformats.org/drawingml/2006/picture">
+                <pic:pic>
+                  <pic:nvPicPr>
+                    <pic:cNvPr id="0" name="Figure_D1_Dashboard_Home_and_Login.png"/>
+                    <pic:cNvPicPr/>
+                  </pic:nvPicPr>
+                  <pic:blipFill>
+                    <a:blip r:embed="rId22"/>
+                    <a:stretch>
+                      <a:fillRect/>
+                    </a:stretch>
+                  </pic:blipFill>
+                  <pic:spPr>
+                    <a:xfrm>
+                      <a:off x="0" y="0"/>
+                      <a:ext cx="5486400" cy="6236970"/>
+                    </a:xfrm>
+                    <a:prstGeom prst="rect"/>
+                  </pic:spPr>
+                </pic:pic>
+              </a:graphicData>
+            </a:graphic>
+          </wp:inline>
+        </w:drawing>
       </w:r>
     </w:p>
     <w:p>
       <w:pPr>
         <w:spacing w:after="20" w:before="0"/>
+      </w:pPr>
+      <w:r/>
+    </w:p>
+    <w:p>
+      <w:pPr>
+        <w:spacing w:after="80" w:before="0"/>
+      </w:pPr>
+      <w:r/>
+    </w:p>
+    <w:p>
+      <w:pPr>
+        <w:spacing w:after="120" w:before="60"/>
+        <w:jc w:val="center"/>
       </w:pPr>
       <w:r>
         <w:rPr>
           <w:rFonts w:ascii="Times New Roman" w:cs="Times New Roman" w:eastAsia="Times New Roman" w:hAnsi="Times New Roman"/>
           <w:i/>
           <w:iCs/>
-          <w:color w:val="555555"/>
-          <w:sz w:val="20"/>
-          <w:szCs w:val="20"/>
-        </w:rPr>
-        <w:t xml:space="preserve">Screenshot to insert: Dashboard – Home Page and Login Screen</w:t>
-      </w:r>
+          <w:color w:val="000000"/>
+          <w:sz w:val="18"/>
+          <w:szCs w:val="18"/>
+        </w:rPr>
+        <w:t xml:space="preserve">Figure D.1 – Dashboard – Home Page and Login Screen</w:t>
+      </w:r>
+    </w:p>
+    <w:p>
+      <w:pPr>
+        <w:spacing w:after="60" w:before="120"/>
+      </w:pPr>
+      <w:r/>
+      <w:r>
+        <w:drawing>
+          <wp:inline xmlns:a="http://schemas.openxmlformats.org/drawingml/2006/main" xmlns:pic="http://schemas.openxmlformats.org/drawingml/2006/picture">
+            <wp:extent cx="5486400" cy="3089910"/>
+            <wp:docPr id="3" name="Picture 3"/>
+            <wp:cNvGraphicFramePr>
+              <a:graphicFrameLocks noChangeAspect="1"/>
+            </wp:cNvGraphicFramePr>
+            <a:graphic>
+              <a:graphicData uri="http://schemas.openxmlformats.org/drawingml/2006/picture">
+                <pic:pic>
+                  <pic:nvPicPr>
+                    <pic:cNvPr id="0" name="Figure_D2_Chair_Dashboard.png"/>
+                    <pic:cNvPicPr/>
+                  </pic:nvPicPr>
+                  <pic:blipFill>
+                    <a:blip r:embed="rId23"/>
+                    <a:stretch>
+                      <a:fillRect/>
+                    </a:stretch>
+                  </pic:blipFill>
+                  <pic:spPr>
+                    <a:xfrm>
+                      <a:off x="0" y="0"/>
+                      <a:ext cx="5486400" cy="3089910"/>
+                    </a:xfrm>
+                    <a:prstGeom prst="rect"/>
+                  </pic:spPr>
+                </pic:pic>
+              </a:graphicData>
+            </a:graphic>
+          </wp:inline>
+        </w:drawing>
+      </w:r>
+    </w:p>
+    <w:p>
+      <w:pPr>
+        <w:spacing w:after="20" w:before="0"/>
+      </w:pPr>
+      <w:r/>
     </w:p>
     <w:p>
       <w:pPr>
         <w:spacing w:after="80" w:before="0"/>
       </w:pPr>
-      <w:r>
-        <w:rPr>
-          <w:rFonts w:ascii="Times New Roman" w:cs="Times New Roman" w:eastAsia="Times New Roman" w:hAnsi="Times New Roman"/>
-          <w:color w:val="555555"/>
-          <w:sz w:val="20"/>
-          <w:szCs w:val="20"/>
-        </w:rPr>
-        <w:t xml:space="preserve">What to show: The public landing page with conference listing and the login screen with one-click demo credential buttons.</w:t>
-      </w:r>
+      <w:r/>
     </w:p>
     <w:p>
       <w:pPr>
@@ -30327,180 +30402,129 @@
           <w:sz w:val="18"/>
           <w:szCs w:val="18"/>
         </w:rPr>
-        <w:t xml:space="preserve">Figure D.1 – Dashboard – Home Page and Login Screen</w:t>
+        <w:t xml:space="preserve">Figure D.2 – Chair Dashboard – KPI Cards and Submission Queue</w:t>
       </w:r>
     </w:p>
     <w:p>
       <w:pPr>
         <w:spacing w:after="60" w:before="120"/>
       </w:pPr>
-      <w:r>
-        <w:rPr>
-          <w:rFonts w:ascii="Times New Roman" w:cs="Times New Roman" w:eastAsia="Times New Roman" w:hAnsi="Times New Roman"/>
-          <w:b/>
-          <w:bCs/>
-          <w:color w:val="B22222"/>
-          <w:sz w:val="22"/>
-          <w:szCs w:val="22"/>
-        </w:rPr>
-        <w:t xml:space="preserve">[PLACEHOLDER – Figure D.2]</w:t>
+      <w:r/>
+      <w:r>
+        <w:drawing>
+          <wp:inline xmlns:a="http://schemas.openxmlformats.org/drawingml/2006/main" xmlns:pic="http://schemas.openxmlformats.org/drawingml/2006/picture">
+            <wp:extent cx="5486400" cy="3089910"/>
+            <wp:docPr id="4" name="Picture 4"/>
+            <wp:cNvGraphicFramePr>
+              <a:graphicFrameLocks noChangeAspect="1"/>
+            </wp:cNvGraphicFramePr>
+            <a:graphic>
+              <a:graphicData uri="http://schemas.openxmlformats.org/drawingml/2006/picture">
+                <pic:pic>
+                  <pic:nvPicPr>
+                    <pic:cNvPr id="0" name="Figure_D3_Paper_Detail_Review_Panel.png"/>
+                    <pic:cNvPicPr/>
+                  </pic:nvPicPr>
+                  <pic:blipFill>
+                    <a:blip r:embed="rId24"/>
+                    <a:stretch>
+                      <a:fillRect/>
+                    </a:stretch>
+                  </pic:blipFill>
+                  <pic:spPr>
+                    <a:xfrm>
+                      <a:off x="0" y="0"/>
+                      <a:ext cx="5486400" cy="3089910"/>
+                    </a:xfrm>
+                    <a:prstGeom prst="rect"/>
+                  </pic:spPr>
+                </pic:pic>
+              </a:graphicData>
+            </a:graphic>
+          </wp:inline>
+        </w:drawing>
       </w:r>
     </w:p>
     <w:p>
       <w:pPr>
         <w:spacing w:after="20" w:before="0"/>
+      </w:pPr>
+      <w:r/>
+    </w:p>
+    <w:p>
+      <w:pPr>
+        <w:spacing w:after="80" w:before="0"/>
+      </w:pPr>
+      <w:r/>
+    </w:p>
+    <w:p>
+      <w:pPr>
+        <w:spacing w:after="120" w:before="60"/>
+        <w:jc w:val="center"/>
       </w:pPr>
       <w:r>
         <w:rPr>
           <w:rFonts w:ascii="Times New Roman" w:cs="Times New Roman" w:eastAsia="Times New Roman" w:hAnsi="Times New Roman"/>
           <w:i/>
           <w:iCs/>
-          <w:color w:val="555555"/>
-          <w:sz w:val="20"/>
-          <w:szCs w:val="20"/>
-        </w:rPr>
-        <w:t xml:space="preserve">Screenshot to insert: Chair Dashboard – KPI Cards and Submission Queue</w:t>
-      </w:r>
-    </w:p>
-    <w:p>
-      <w:pPr>
-        <w:spacing w:after="80" w:before="0"/>
-      </w:pPr>
-      <w:r>
-        <w:rPr>
-          <w:rFonts w:ascii="Times New Roman" w:cs="Times New Roman" w:eastAsia="Times New Roman" w:hAnsi="Times New Roman"/>
-          <w:color w:val="555555"/>
-          <w:sz w:val="20"/>
-          <w:szCs w:val="20"/>
-        </w:rPr>
-        <w:t xml:space="preserve">What to show: The Program Chair dashboard with KPI cards (submission count, acceptance ring, papers needing reviewers), 8-week sparkline chart and the "Needs Reviewers" priority queue with auto-assign buttons.</w:t>
-      </w:r>
-    </w:p>
-    <w:p>
-      <w:pPr>
-        <w:spacing w:after="120" w:before="60"/>
-        <w:jc w:val="center"/>
-      </w:pPr>
-      <w:r>
-        <w:rPr>
-          <w:rFonts w:ascii="Times New Roman" w:cs="Times New Roman" w:eastAsia="Times New Roman" w:hAnsi="Times New Roman"/>
-          <w:i/>
-          <w:iCs/>
           <w:color w:val="000000"/>
           <w:sz w:val="18"/>
           <w:szCs w:val="18"/>
         </w:rPr>
-        <w:t xml:space="preserve">Figure D.2 – Chair Dashboard – KPI Cards and Submission Queue</w:t>
+        <w:t xml:space="preserve">Figure D.3 – Paper Detail View with Review Panel</w:t>
       </w:r>
     </w:p>
     <w:p>
       <w:pPr>
         <w:spacing w:after="60" w:before="120"/>
       </w:pPr>
-      <w:r>
-        <w:rPr>
-          <w:rFonts w:ascii="Times New Roman" w:cs="Times New Roman" w:eastAsia="Times New Roman" w:hAnsi="Times New Roman"/>
-          <w:b/>
-          <w:bCs/>
-          <w:color w:val="B22222"/>
-          <w:sz w:val="22"/>
-          <w:szCs w:val="22"/>
-        </w:rPr>
-        <w:t xml:space="preserve">[PLACEHOLDER – Figure D.3]</w:t>
+      <w:r/>
+      <w:r>
+        <w:drawing>
+          <wp:inline xmlns:a="http://schemas.openxmlformats.org/drawingml/2006/main" xmlns:pic="http://schemas.openxmlformats.org/drawingml/2006/picture">
+            <wp:extent cx="5486400" cy="6236970"/>
+            <wp:docPr id="5" name="Picture 5"/>
+            <wp:cNvGraphicFramePr>
+              <a:graphicFrameLocks noChangeAspect="1"/>
+            </wp:cNvGraphicFramePr>
+            <a:graphic>
+              <a:graphicData uri="http://schemas.openxmlformats.org/drawingml/2006/picture">
+                <pic:pic>
+                  <pic:nvPicPr>
+                    <pic:cNvPr id="0" name="Figure_D4_Payment_Checkout_and_Confirmation.png"/>
+                    <pic:cNvPicPr/>
+                  </pic:nvPicPr>
+                  <pic:blipFill>
+                    <a:blip r:embed="rId25"/>
+                    <a:stretch>
+                      <a:fillRect/>
+                    </a:stretch>
+                  </pic:blipFill>
+                  <pic:spPr>
+                    <a:xfrm>
+                      <a:off x="0" y="0"/>
+                      <a:ext cx="5486400" cy="6236970"/>
+                    </a:xfrm>
+                    <a:prstGeom prst="rect"/>
+                  </pic:spPr>
+                </pic:pic>
+              </a:graphicData>
+            </a:graphic>
+          </wp:inline>
+        </w:drawing>
       </w:r>
     </w:p>
     <w:p>
       <w:pPr>
         <w:spacing w:after="20" w:before="0"/>
       </w:pPr>
-      <w:r>
-        <w:rPr>
-          <w:rFonts w:ascii="Times New Roman" w:cs="Times New Roman" w:eastAsia="Times New Roman" w:hAnsi="Times New Roman"/>
-          <w:i/>
-          <w:iCs/>
-          <w:color w:val="555555"/>
-          <w:sz w:val="20"/>
-          <w:szCs w:val="20"/>
-        </w:rPr>
-        <w:t xml:space="preserve">Screenshot to insert: Paper Detail View with Review Panel</w:t>
-      </w:r>
+      <w:r/>
     </w:p>
     <w:p>
       <w:pPr>
         <w:spacing w:after="80" w:before="0"/>
       </w:pPr>
-      <w:r>
-        <w:rPr>
-          <w:rFonts w:ascii="Times New Roman" w:cs="Times New Roman" w:eastAsia="Times New Roman" w:hAnsi="Times New Roman"/>
-          <w:color w:val="555555"/>
-          <w:sz w:val="20"/>
-          <w:szCs w:val="20"/>
-        </w:rPr>
-        <w:t xml:space="preserve">What to show: The paper detail page displaying the multi-step lifecycle stepper, manuscript metadata, the review table with scores and critiques, and the algorithmic decision suggestion panel showing "Suggested: Accepted (Average score 8.0 / 10)".</w:t>
-      </w:r>
-    </w:p>
-    <w:p>
-      <w:pPr>
-        <w:spacing w:after="120" w:before="60"/>
-        <w:jc w:val="center"/>
-      </w:pPr>
-      <w:r>
-        <w:rPr>
-          <w:rFonts w:ascii="Times New Roman" w:cs="Times New Roman" w:eastAsia="Times New Roman" w:hAnsi="Times New Roman"/>
-          <w:i/>
-          <w:iCs/>
-          <w:color w:val="000000"/>
-          <w:sz w:val="18"/>
-          <w:szCs w:val="18"/>
-        </w:rPr>
-        <w:t xml:space="preserve">Figure D.3 – Paper Detail View with Review Panel</w:t>
-      </w:r>
-    </w:p>
-    <w:p>
-      <w:pPr>
-        <w:spacing w:after="60" w:before="120"/>
-      </w:pPr>
-      <w:r>
-        <w:rPr>
-          <w:rFonts w:ascii="Times New Roman" w:cs="Times New Roman" w:eastAsia="Times New Roman" w:hAnsi="Times New Roman"/>
-          <w:b/>
-          <w:bCs/>
-          <w:color w:val="B22222"/>
-          <w:sz w:val="22"/>
-          <w:szCs w:val="22"/>
-        </w:rPr>
-        <w:t xml:space="preserve">[PLACEHOLDER – Figure D.4]</w:t>
-      </w:r>
-    </w:p>
-    <w:p>
-      <w:pPr>
-        <w:spacing w:after="20" w:before="0"/>
-      </w:pPr>
-      <w:r>
-        <w:rPr>
-          <w:rFonts w:ascii="Times New Roman" w:cs="Times New Roman" w:eastAsia="Times New Roman" w:hAnsi="Times New Roman"/>
-          <w:i/>
-          <w:iCs/>
-          <w:color w:val="555555"/>
-          <w:sz w:val="20"/>
-          <w:szCs w:val="20"/>
-        </w:rPr>
-        <w:t xml:space="preserve">Screenshot to insert: Payment Checkout and Registration Confirmation</w:t>
-      </w:r>
-    </w:p>
-    <w:p>
-      <w:pPr>
-        <w:spacing w:after="80" w:before="0"/>
-      </w:pPr>
-      <w:r>
-        <w:rPr>
-          <w:rFonts w:ascii="Times New Roman" w:cs="Times New Roman" w:eastAsia="Times New Roman" w:hAnsi="Times New Roman"/>
-          <w:color w:val="555555"/>
-          <w:sz w:val="20"/>
-          <w:szCs w:val="20"/>
-        </w:rPr>
-        <w:t xml:space="preserve">What to show: The payment checkout form with category selection, early-bird discount display and credit card fields, followed by the registration confirmation screen showing the transaction reference and confirmed status.</w:t>
-      </w:r>
+      <w:r/>
     </w:p>
     <w:p>
       <w:pPr>

</xml_diff>